<commit_message>
Submission: prototype link and clearer research row in AI Declaration
Co-Authored-By: Claude Opus 5.5 <noreply@anthropic.com>
Claude-Session: https://claude.ai/code/session_01HrYY9Y9MwxQVFQRES5YEHH
</commit_message>
<xml_diff>
--- a/submission/TeamName_TechnologyProduct.docx
+++ b/submission/TeamName_TechnologyProduct.docx
@@ -2,7 +2,7 @@
 <file path=word/document.xml><?xml version="1.0" encoding="utf-8"?>
 <w:document xmlns:w="http://schemas.openxmlformats.org/wordprocessingml/2006/main" xmlns:m="http://schemas.openxmlformats.org/officeDocument/2006/math" xmlns:r="http://schemas.openxmlformats.org/officeDocument/2006/relationships" xmlns:o="urn:schemas-microsoft-com:office:office" xmlns:v="urn:schemas-microsoft-com:vml" xmlns:w10="urn:schemas-microsoft-com:office:word" xmlns:a="http://schemas.openxmlformats.org/drawingml/2006/main" xmlns:pic="http://schemas.openxmlformats.org/drawingml/2006/picture" xmlns:wp="http://schemas.openxmlformats.org/drawingml/2006/wordprocessingDrawing">
   <w:body>
-    <w:bookmarkStart w:id="37" w:name="saryarqa-go"/>
+    <w:bookmarkStart w:id="38" w:name="saryarqa-go"/>
     <w:p>
       <w:pPr>
         <w:pStyle w:val="Heading1"/>
@@ -30,10 +30,21 @@
         <w:pStyle w:val="BodyText"/>
       </w:pPr>
       <w:r>
-        <w:t xml:space="preserve">Saryarqa Routes wants 30% of its travelers to come from abroad within 24 months, but today about 96% of its 3,400 travelers are from Kazakhstan (case data). We propose Saryarqa Go, a booking platform in English and Chinese for independent travelers from China. It shows exactly what each tour includes, lets travelers meet their guide before paying, and accepts foreign cards. The first version can be built in 12 weeks within the 20 million KZT budget.</w:t>
-      </w:r>
-    </w:p>
-    <w:bookmarkStart w:id="22" w:name="problem-and-market"/>
+        <w:t xml:space="preserve">Saryarqa Routes wants 30% of its travelers to come from abroad within 24 months, but today about 96% of its 3,400 travelers are from Kazakhstan (case data). We propose Saryarqa Go, a booking platform in English and Chinese for independent travelers from China. It shows exactly what each tour includes, lets travelers meet their guide before paying, and accepts foreign cards. The first version can be built in 12 weeks within the 20 million KZT budget. Clickable prototype:</w:t>
+      </w:r>
+      <w:r>
+        <w:t xml:space="preserve"> </w:t>
+      </w:r>
+      <w:hyperlink r:id="rId20">
+        <w:r>
+          <w:rPr>
+            <w:rStyle w:val="Hyperlink"/>
+          </w:rPr>
+          <w:t xml:space="preserve">https://claude.ai/artifact/NH9vk9BuaLC4qGUy8eSsYr</w:t>
+        </w:r>
+      </w:hyperlink>
+    </w:p>
+    <w:bookmarkStart w:id="23" w:name="problem-and-market"/>
     <w:p>
       <w:pPr>
         <w:pStyle w:val="Heading2"/>
@@ -42,7 +53,7 @@
         <w:t xml:space="preserve">1. Problem and market</w:t>
       </w:r>
     </w:p>
-    <w:bookmarkStart w:id="20" w:name="X54094dc9f4e4f36dbabd42aa797528da709daea"/>
+    <w:bookmarkStart w:id="21" w:name="X54094dc9f4e4f36dbabd42aa797528da709daea"/>
     <w:p>
       <w:pPr>
         <w:pStyle w:val="Heading4"/>
@@ -59,8 +70,8 @@
         <w:t xml:space="preserve">According to the Ministry of Tourism and Sports, about 655,000 people from China visited Kazakhstan in 2024, 78% more than in 2023 [1][2]. Since November 2023 the two countries have a visa-free regime: up to 30 days per visit and up to 90 days in any 180 days [1]. In 2024 China was the largest source of tourists outside the neighbouring countries [3]. Overall, Kazakhstan counted 15.3 million foreign visitors for tourism in 2024 [3] and 15.7 million in the first nine months of 2025 [5]. An analyst estimate gives 241,700 Chinese visitors in 2025 [4], but it is counted in a different way from the Ministry figure, so we do not compare the two. The tours fit what independent travelers look for: nature and photography (Charyn, Kolsai, Burabay) and Silk Road history (Turkestan). This last point is our own judgement.</w:t>
       </w:r>
     </w:p>
-    <w:bookmarkEnd w:id="20"/>
-    <w:bookmarkStart w:id="21" w:name="what-stops-them-from-booking-today"/>
+    <w:bookmarkEnd w:id="21"/>
+    <w:bookmarkStart w:id="22" w:name="what-stops-them-from-booking-today"/>
     <w:p>
       <w:pPr>
         <w:pStyle w:val="Heading4"/>
@@ -291,9 +302,9 @@
         <w:t xml:space="preserve">About 4% of 3,400 travelers (roughly 136) are foreign today. If the company keeps its 3,264 local travelers, 30% foreign means about 4,663 travelers in total and about 1,399 foreigners. So the company needs around 1,263 additional foreign travelers per year, about 105 per month.</w:t>
       </w:r>
     </w:p>
-    <w:bookmarkEnd w:id="21"/>
     <w:bookmarkEnd w:id="22"/>
-    <w:bookmarkStart w:id="23" w:name="existing-solutions"/>
+    <w:bookmarkEnd w:id="23"/>
+    <w:bookmarkStart w:id="24" w:name="existing-solutions"/>
     <w:p>
       <w:pPr>
         <w:pStyle w:val="Heading2"/>
@@ -318,8 +329,8 @@
         <w:t xml:space="preserve">The company's current tools (Instagram, WhatsApp, phone) keep the relationship but fail all four complaints above. Saryarqa Go keeps the direct relationship and the full margin, and adds what the platforms do not: the "not yet confirmed" list, meeting the guide before paying, and help in Chinese. Later we can still list on Trip.com as an extra channel.</w:t>
       </w:r>
     </w:p>
-    <w:bookmarkEnd w:id="23"/>
-    <w:bookmarkStart w:id="27" w:name="our-product"/>
+    <w:bookmarkEnd w:id="24"/>
+    <w:bookmarkStart w:id="28" w:name="our-product"/>
     <w:p>
       <w:pPr>
         <w:pStyle w:val="Heading2"/>
@@ -489,18 +500,18 @@
           <wp:inline>
             <wp:extent cx="5334000" cy="3412463"/>
             <wp:effectExtent b="0" l="0" r="0" t="0"/>
-            <wp:docPr descr="" title="" id="25" name="Picture"/>
+            <wp:docPr descr="" title="" id="26" name="Picture"/>
             <a:graphic>
               <a:graphicData uri="http://schemas.openxmlformats.org/drawingml/2006/picture">
                 <pic:pic>
                   <pic:nvPicPr>
-                    <pic:cNvPr descr="/home/user/ZERttex/docs/img/complaints.png" id="26" name="Picture"/>
+                    <pic:cNvPr descr="/home/user/ZERttex/docs/img/complaints.png" id="27" name="Picture"/>
                     <pic:cNvPicPr>
                       <a:picLocks noChangeArrowheads="1" noChangeAspect="1"/>
                     </pic:cNvPicPr>
                   </pic:nvPicPr>
                   <pic:blipFill>
-                    <a:blip r:embed="rId24"/>
+                    <a:blip r:embed="rId25"/>
                     <a:stretch>
                       <a:fillRect/>
                     </a:stretch>
@@ -535,8 +546,8 @@
         <w:t xml:space="preserve">Figure 1. Our clickable prototype: each complaint from the case is linked to a feature.</w:t>
       </w:r>
     </w:p>
-    <w:bookmarkEnd w:id="27"/>
-    <w:bookmarkStart w:id="31" w:name="mvp-and-implementation"/>
+    <w:bookmarkEnd w:id="28"/>
+    <w:bookmarkStart w:id="32" w:name="mvp-and-implementation"/>
     <w:p>
       <w:pPr>
         <w:pStyle w:val="Heading2"/>
@@ -866,8 +877,19 @@
         <w:t xml:space="preserve"> </w:t>
       </w:r>
       <w:r>
-        <w:t xml:space="preserve">5-8 usability sessions with Chinese-speaking travelers, then a pilot where we measure how many people who start a booking finish it, how often the chat has to hand off to a manager, and how many postcards lead to new bookings. We already built a working clickable prototype of the whole path; payments in it are simulated.</w:t>
-      </w:r>
+        <w:t xml:space="preserve">5-8 usability sessions with Chinese-speaking travelers, then a pilot where we measure how many people who start a booking finish it, how often the chat has to hand off to a manager, and how many postcards lead to new bookings. We already built a working clickable prototype of the whole path (payments in it are simulated):</w:t>
+      </w:r>
+      <w:r>
+        <w:t xml:space="preserve"> </w:t>
+      </w:r>
+      <w:hyperlink r:id="rId20">
+        <w:r>
+          <w:rPr>
+            <w:rStyle w:val="Hyperlink"/>
+          </w:rPr>
+          <w:t xml:space="preserve">https://claude.ai/artifact/NH9vk9BuaLC4qGUy8eSsYr</w:t>
+        </w:r>
+      </w:hyperlink>
     </w:p>
     <w:p>
       <w:pPr>
@@ -878,18 +900,18 @@
           <wp:inline>
             <wp:extent cx="5334000" cy="3200400"/>
             <wp:effectExtent b="0" l="0" r="0" t="0"/>
-            <wp:docPr descr="" title="" id="29" name="Picture"/>
+            <wp:docPr descr="" title="" id="30" name="Picture"/>
             <a:graphic>
               <a:graphicData uri="http://schemas.openxmlformats.org/drawingml/2006/picture">
                 <pic:pic>
                   <pic:nvPicPr>
-                    <pic:cNvPr descr="/home/user/ZERttex/submission/html/flow.png" id="30" name="Picture"/>
+                    <pic:cNvPr descr="/home/user/ZERttex/submission/html/flow.png" id="31" name="Picture"/>
                     <pic:cNvPicPr>
                       <a:picLocks noChangeArrowheads="1" noChangeAspect="1"/>
                     </pic:cNvPicPr>
                   </pic:nvPicPr>
                   <pic:blipFill>
-                    <a:blip r:embed="rId28"/>
+                    <a:blip r:embed="rId29"/>
                     <a:stretch>
                       <a:fillRect/>
                     </a:stretch>
@@ -924,8 +946,8 @@
         <w:t xml:space="preserve">Figure 2. User flow from search to payment. Dashed boxes are optional.</w:t>
       </w:r>
     </w:p>
-    <w:bookmarkEnd w:id="31"/>
-    <w:bookmarkStart w:id="35" w:name="costs-payback-and-impact"/>
+    <w:bookmarkEnd w:id="32"/>
+    <w:bookmarkStart w:id="36" w:name="costs-payback-and-impact"/>
     <w:p>
       <w:pPr>
         <w:pStyle w:val="Heading2"/>
@@ -1215,18 +1237,18 @@
           <wp:inline>
             <wp:extent cx="5334000" cy="2222500"/>
             <wp:effectExtent b="0" l="0" r="0" t="0"/>
-            <wp:docPr descr="" title="" id="33" name="Picture"/>
+            <wp:docPr descr="" title="" id="34" name="Picture"/>
             <a:graphic>
               <a:graphicData uri="http://schemas.openxmlformats.org/drawingml/2006/picture">
                 <pic:pic>
                   <pic:nvPicPr>
-                    <pic:cNvPr descr="/home/user/ZERttex/submission/html/chart.png" id="34" name="Picture"/>
+                    <pic:cNvPr descr="/home/user/ZERttex/submission/html/chart.png" id="35" name="Picture"/>
                     <pic:cNvPicPr>
                       <a:picLocks noChangeArrowheads="1" noChangeAspect="1"/>
                     </pic:cNvPicPr>
                   </pic:nvPicPr>
                   <pic:blipFill>
-                    <a:blip r:embed="rId32"/>
+                    <a:blip r:embed="rId33"/>
                     <a:stretch>
                       <a:fillRect/>
                     </a:stretch>
@@ -1692,8 +1714,8 @@
         </w:tc>
       </w:tr>
     </w:tbl>
-    <w:bookmarkEnd w:id="35"/>
-    <w:bookmarkStart w:id="36" w:name="conclusion"/>
+    <w:bookmarkEnd w:id="36"/>
+    <w:bookmarkStart w:id="37" w:name="conclusion"/>
     <w:p>
       <w:pPr>
         <w:pStyle w:val="Heading2"/>
@@ -1715,9 +1737,9 @@
         <w:br w:type="page"/>
       </w:r>
     </w:p>
-    <w:bookmarkEnd w:id="36"/>
     <w:bookmarkEnd w:id="37"/>
-    <w:bookmarkStart w:id="47" w:name="references"/>
+    <w:bookmarkEnd w:id="38"/>
+    <w:bookmarkStart w:id="48" w:name="references"/>
     <w:p>
       <w:pPr>
         <w:pStyle w:val="Heading1"/>
@@ -1748,7 +1770,7 @@
       <w:r>
         <w:t xml:space="preserve"> </w:t>
       </w:r>
-      <w:hyperlink r:id="rId38">
+      <w:hyperlink r:id="rId39">
         <w:r>
           <w:rPr>
             <w:rStyle w:val="Hyperlink"/>
@@ -1771,7 +1793,7 @@
       <w:r>
         <w:t xml:space="preserve"> </w:t>
       </w:r>
-      <w:hyperlink r:id="rId39">
+      <w:hyperlink r:id="rId40">
         <w:r>
           <w:rPr>
             <w:rStyle w:val="Hyperlink"/>
@@ -1794,7 +1816,7 @@
       <w:r>
         <w:t xml:space="preserve"> </w:t>
       </w:r>
-      <w:hyperlink r:id="rId40">
+      <w:hyperlink r:id="rId41">
         <w:r>
           <w:rPr>
             <w:rStyle w:val="Hyperlink"/>
@@ -1817,7 +1839,7 @@
       <w:r>
         <w:t xml:space="preserve"> </w:t>
       </w:r>
-      <w:hyperlink r:id="rId41">
+      <w:hyperlink r:id="rId42">
         <w:r>
           <w:rPr>
             <w:rStyle w:val="Hyperlink"/>
@@ -1840,7 +1862,7 @@
       <w:r>
         <w:t xml:space="preserve"> </w:t>
       </w:r>
-      <w:hyperlink r:id="rId42">
+      <w:hyperlink r:id="rId43">
         <w:r>
           <w:rPr>
             <w:rStyle w:val="Hyperlink"/>
@@ -1863,7 +1885,7 @@
       <w:r>
         <w:t xml:space="preserve"> </w:t>
       </w:r>
-      <w:hyperlink r:id="rId43">
+      <w:hyperlink r:id="rId44">
         <w:r>
           <w:rPr>
             <w:rStyle w:val="Hyperlink"/>
@@ -1886,7 +1908,7 @@
       <w:r>
         <w:t xml:space="preserve"> </w:t>
       </w:r>
-      <w:hyperlink r:id="rId44">
+      <w:hyperlink r:id="rId45">
         <w:r>
           <w:rPr>
             <w:rStyle w:val="Hyperlink"/>
@@ -1909,7 +1931,7 @@
       <w:r>
         <w:t xml:space="preserve"> </w:t>
       </w:r>
-      <w:hyperlink r:id="rId45">
+      <w:hyperlink r:id="rId46">
         <w:r>
           <w:rPr>
             <w:rStyle w:val="Hyperlink"/>
@@ -1932,7 +1954,7 @@
       <w:r>
         <w:t xml:space="preserve"> </w:t>
       </w:r>
-      <w:hyperlink r:id="rId46">
+      <w:hyperlink r:id="rId47">
         <w:r>
           <w:rPr>
             <w:rStyle w:val="Hyperlink"/>
@@ -1966,8 +1988,8 @@
         <w:br w:type="page"/>
       </w:r>
     </w:p>
-    <w:bookmarkEnd w:id="47"/>
-    <w:bookmarkStart w:id="51" w:name="ai-declaration"/>
+    <w:bookmarkEnd w:id="48"/>
+    <w:bookmarkStart w:id="52" w:name="ai-declaration"/>
     <w:p>
       <w:pPr>
         <w:pStyle w:val="Heading1"/>
@@ -1984,7 +2006,7 @@
         <w:t xml:space="preserve">Team: ____________________</w:t>
       </w:r>
     </w:p>
-    <w:bookmarkStart w:id="48" w:name="level-of-ai-use"/>
+    <w:bookmarkStart w:id="49" w:name="level-of-ai-use"/>
     <w:p>
       <w:pPr>
         <w:pStyle w:val="Heading3"/>
@@ -2169,31 +2191,31 @@
               <w:jc w:val="left"/>
             </w:pPr>
             <w:r>
-              <w:t xml:space="preserve">Sources</w:t>
-            </w:r>
-          </w:p>
-        </w:tc>
-        <w:tc>
-          <w:tcPr/>
-          <w:p>
-            <w:pPr>
-              <w:pStyle w:val="Compact"/>
-              <w:jc w:val="left"/>
-            </w:pPr>
-            <w:r>
-              <w:t xml:space="preserve">Medium</w:t>
-            </w:r>
-          </w:p>
-        </w:tc>
-        <w:tc>
-          <w:tcPr/>
-          <w:p>
-            <w:pPr>
-              <w:pStyle w:val="Compact"/>
-              <w:jc w:val="left"/>
-            </w:pPr>
-            <w:r>
-              <w:t xml:space="preserve">The AI used web search to check our sources and found that the 15.7 million figure is for the first nine months of 2025. We checked the links ourselves.</w:t>
+              <w:t xml:space="preserve">Research and sources</w:t>
+            </w:r>
+          </w:p>
+        </w:tc>
+        <w:tc>
+          <w:tcPr/>
+          <w:p>
+            <w:pPr>
+              <w:pStyle w:val="Compact"/>
+              <w:jc w:val="left"/>
+            </w:pPr>
+            <w:r>
+              <w:t xml:space="preserve">Low to medium</w:t>
+            </w:r>
+          </w:p>
+        </w:tc>
+        <w:tc>
+          <w:tcPr/>
+          <w:p>
+            <w:pPr>
+              <w:pStyle w:val="Compact"/>
+              <w:jc w:val="left"/>
+            </w:pPr>
+            <w:r>
+              <w:t xml:space="preserve">The team chose the target market and found the main market sources. The AI was used only to double-check them with web search: it found that the 15.7 million figure is for the first nine months of 2025 and suggested additional references (Trip.com, GetYourGuide, The Astana Times, World Bank, national statistics). We opened and checked the links ourselves.</w:t>
             </w:r>
           </w:p>
         </w:tc>
@@ -2237,8 +2259,8 @@
         </w:tc>
       </w:tr>
     </w:tbl>
-    <w:bookmarkEnd w:id="48"/>
-    <w:bookmarkStart w:id="50" w:name="tools"/>
+    <w:bookmarkEnd w:id="49"/>
+    <w:bookmarkStart w:id="51" w:name="tools"/>
     <w:p>
       <w:pPr>
         <w:pStyle w:val="Heading3"/>
@@ -2332,7 +2354,7 @@
               <w:pStyle w:val="Compact"/>
               <w:jc w:val="left"/>
             </w:pPr>
-            <w:hyperlink r:id="rId49">
+            <w:hyperlink r:id="rId50">
               <w:r>
                 <w:rPr>
                   <w:rStyle w:val="Hyperlink"/>
@@ -2398,8 +2420,8 @@
         <w:t xml:space="preserve">Signed: ____________________     Date: ______________</w:t>
       </w:r>
     </w:p>
-    <w:bookmarkEnd w:id="50"/>
     <w:bookmarkEnd w:id="51"/>
+    <w:bookmarkEnd w:id="52"/>
     <w:sectPr/>
     <w:pgSz w:w="11906" w:h="16838"/>
     <w:pgMar w:top="1440" w:right="1440" w:bottom="1440" w:left="1440" w:header="720" w:footer="720" w:gutter="0"/>

</xml_diff>

<commit_message>
Submission: GitHub Pages link and the five required parts as separate files
Co-Authored-By: Claude Opus 5.5 <noreply@anthropic.com>
Claude-Session: https://claude.ai/code/session_01HrYY9Y9MwxQVFQRES5YEHH
</commit_message>
<xml_diff>
--- a/submission/TeamName_TechnologyProduct.docx
+++ b/submission/TeamName_TechnologyProduct.docx
@@ -40,7 +40,7 @@
           <w:rPr>
             <w:rStyle w:val="Hyperlink"/>
           </w:rPr>
-          <w:t xml:space="preserve">https://claude.ai/artifact/NH9vk9BuaLC4qGUy8eSsYr</w:t>
+          <w:t xml:space="preserve">https://diawx-6669.github.io/ZERttex/</w:t>
         </w:r>
       </w:hyperlink>
     </w:p>
@@ -887,7 +887,7 @@
           <w:rPr>
             <w:rStyle w:val="Hyperlink"/>
           </w:rPr>
-          <w:t xml:space="preserve">https://claude.ai/artifact/NH9vk9BuaLC4qGUy8eSsYr</w:t>
+          <w:t xml:space="preserve">https://diawx-6669.github.io/ZERttex/</w:t>
         </w:r>
       </w:hyperlink>
     </w:p>

</xml_diff>

<commit_message>
Docs and generators read money numbers from the one budget config
- scripts/lib/model.cjs bundles budget.ts + paybackModel.ts for Node scripts
- build-submission.cjs: budget table, payback, break-even all from config; MVP scope text updated
- scripts/sync-money-docs.cjs + npm run sync:money: README/REPORT/REPORT_NOTES/PLAN numbers via invisible markers
- Regenerated submission/ PDFs + DOCX; removed stale Saryarqa_Go_Submission_ALL.html

Co-Authored-By: Claude Opus 5.5 <noreply@anthropic.com>
Claude-Session: https://claude.ai/code/session_01QhrEeAaLVkc56tMtC6WgXx
</commit_message>
<xml_diff>
--- a/submission/TeamName_TechnologyProduct.docx
+++ b/submission/TeamName_TechnologyProduct.docx
@@ -16,7 +16,7 @@
         <w:pStyle w:val="FirstParagraph"/>
       </w:pPr>
       <w:r>
-        <w:t xml:space="preserve">ZERTTEX Hackathon 2026, Stage 1. Case 1: Technology Product</w:t>
+        <w:t xml:space="preserve">ZERTTEX Hackathon 2026, Final (Stage 2). Case 1: Technology Product</w:t>
       </w:r>
       <w:r>
         <w:br/>
@@ -30,7 +30,7 @@
         <w:pStyle w:val="BodyText"/>
       </w:pPr>
       <w:r>
-        <w:t xml:space="preserve">Saryarqa Routes wants 30% of its travelers to come from abroad within 24 months, but today about 96% of its 3,400 travelers are from Kazakhstan (case data). We propose Saryarqa Go, a booking platform in English and Chinese for independent travelers from China. It shows exactly what each tour includes, lets travelers meet their guide before paying, and accepts foreign cards. The first version can be built in 12 weeks within the 20 million KZT budget. Clickable prototype:</w:t>
+        <w:t xml:space="preserve">Saryarqa Routes wants 30% of its travelers to come from abroad within 24 months, but today about 96% of its 3,400 travelers are from Kazakhstan (case data). We propose Saryarqa Go, a booking platform in English and Chinese for independent travelers from China. It shows exactly what each tour includes, lets travelers meet their guide before paying, and accepts foreign cards. The first version can be built in 12 weeks, with all year-1 costs within 8,000,000 KZT. Clickable prototype:</w:t>
       </w:r>
       <w:r>
         <w:t xml:space="preserve"> </w:t>
@@ -561,7 +561,7 @@
         <w:pStyle w:val="FirstParagraph"/>
       </w:pPr>
       <w:r>
-        <w:t xml:space="preserve">The MVP includes the tour pages, the inclusion lists, booking with foreign card payment, the trust page, a simple scripted chat with hand-off to a manager, and the trip page. Things that depend on another company's approval or on live data come later: Alipay and WeChat Pay, a smarter AI chat, live weather data, and listing on Trip.com.</w:t>
+        <w:t xml:space="preserve">The MVP (paid from the 8,000,000 KZT budget) includes the tour pages in English and Chinese with the inclusion lists, booking in three steps with a foreign card on the provider's page, the trust page, a chat that answers only from checked tour data and hands off to a manager, the postcard with a referral QR code, and a manager inbox for staff. Phase 2 comes later: the trip builder, weather and road rescheduling, family updates, the offline audio guide, live Alipay and WeChat Pay, and listing on Trip.com.</w:t>
       </w:r>
     </w:p>
     <w:tbl>
@@ -752,7 +752,7 @@
               <w:jc w:val="left"/>
             </w:pPr>
             <w:r>
-              <w:t xml:space="preserve">Trip page, real payment page, rescheduling</w:t>
+              <w:t xml:space="preserve">Real payment page, manager inbox, postcard QR</w:t>
             </w:r>
           </w:p>
         </w:tc>
@@ -980,18 +980,6 @@
               <w:jc w:val="left"/>
             </w:pPr>
             <w:r>
-              <w:t xml:space="preserve">Part</w:t>
-            </w:r>
-          </w:p>
-        </w:tc>
-        <w:tc>
-          <w:tcPr/>
-          <w:p>
-            <w:pPr>
-              <w:pStyle w:val="Compact"/>
-              <w:jc w:val="left"/>
-            </w:pPr>
-            <w:r>
               <w:t xml:space="preserve">Item</w:t>
             </w:r>
           </w:p>
@@ -1004,6 +992,18 @@
               <w:jc w:val="left"/>
             </w:pPr>
             <w:r>
+              <w:t xml:space="preserve">Type</w:t>
+            </w:r>
+          </w:p>
+        </w:tc>
+        <w:tc>
+          <w:tcPr/>
+          <w:p>
+            <w:pPr>
+              <w:pStyle w:val="Compact"/>
+              <w:jc w:val="left"/>
+            </w:pPr>
+            <w:r>
               <w:t xml:space="preserve">KZT</w:t>
             </w:r>
           </w:p>
@@ -1018,107 +1018,259 @@
               <w:jc w:val="left"/>
             </w:pPr>
             <w:r>
-              <w:t xml:space="preserve">Development (one-time)</w:t>
-            </w:r>
-          </w:p>
-        </w:tc>
-        <w:tc>
-          <w:tcPr/>
-          <w:p>
-            <w:pPr>
-              <w:pStyle w:val="Compact"/>
-              <w:jc w:val="left"/>
-            </w:pPr>
-            <w:r>
-              <w:t xml:space="preserve">Design and development 8.0M; translation 1.5M; payment integration 1.5M; guide videos and photos 1.0M</w:t>
-            </w:r>
-          </w:p>
-        </w:tc>
-        <w:tc>
-          <w:tcPr/>
-          <w:p>
-            <w:pPr>
-              <w:pStyle w:val="Compact"/>
-              <w:jc w:val="left"/>
-            </w:pPr>
-            <w:r>
-              <w:t xml:space="preserve">12,000,000</w:t>
-            </w:r>
-          </w:p>
-        </w:tc>
-      </w:tr>
-      <w:tr>
-        <w:tc>
-          <w:tcPr/>
-          <w:p>
-            <w:pPr>
-              <w:pStyle w:val="Compact"/>
-              <w:jc w:val="left"/>
-            </w:pPr>
-            <w:r>
-              <w:t xml:space="preserve">Launch (year 1)</w:t>
-            </w:r>
-          </w:p>
-        </w:tc>
-        <w:tc>
-          <w:tcPr/>
-          <w:p>
-            <w:pPr>
-              <w:pStyle w:val="Compact"/>
-              <w:jc w:val="left"/>
-            </w:pPr>
-            <w:r>
-              <w:t xml:space="preserve">Marketing on Xiaohongshu and WeChat 4.5M; pilot and support 1.0M</w:t>
-            </w:r>
-          </w:p>
-        </w:tc>
-        <w:tc>
-          <w:tcPr/>
-          <w:p>
-            <w:pPr>
-              <w:pStyle w:val="Compact"/>
-              <w:jc w:val="left"/>
-            </w:pPr>
-            <w:r>
-              <w:t xml:space="preserve">5,500,000</w:t>
-            </w:r>
-          </w:p>
-        </w:tc>
-      </w:tr>
-      <w:tr>
-        <w:tc>
-          <w:tcPr/>
-          <w:p>
-            <w:pPr>
-              <w:pStyle w:val="Compact"/>
-              <w:jc w:val="left"/>
-            </w:pPr>
-            <w:r>
-              <w:t xml:space="preserve">Running costs (year 1)</w:t>
-            </w:r>
-          </w:p>
-        </w:tc>
-        <w:tc>
-          <w:tcPr/>
-          <w:p>
-            <w:pPr>
-              <w:pStyle w:val="Compact"/>
-              <w:jc w:val="left"/>
-            </w:pPr>
-            <w:r>
-              <w:t xml:space="preserve">Hosting, AI usage, maintenance</w:t>
-            </w:r>
-          </w:p>
-        </w:tc>
-        <w:tc>
-          <w:tcPr/>
-          <w:p>
-            <w:pPr>
-              <w:pStyle w:val="Compact"/>
-              <w:jc w:val="left"/>
-            </w:pPr>
-            <w:r>
-              <w:t xml:space="preserve">1,500,000</w:t>
+              <w:t xml:space="preserve">Design &amp; development of MVP</w:t>
+            </w:r>
+          </w:p>
+        </w:tc>
+        <w:tc>
+          <w:tcPr/>
+          <w:p>
+            <w:pPr>
+              <w:pStyle w:val="Compact"/>
+              <w:jc w:val="left"/>
+            </w:pPr>
+            <w:r>
+              <w:t xml:space="preserve">one-time</w:t>
+            </w:r>
+          </w:p>
+        </w:tc>
+        <w:tc>
+          <w:tcPr/>
+          <w:p>
+            <w:pPr>
+              <w:pStyle w:val="Compact"/>
+              <w:jc w:val="left"/>
+            </w:pPr>
+            <w:r>
+              <w:t xml:space="preserve">3,300,000</w:t>
+            </w:r>
+          </w:p>
+        </w:tc>
+      </w:tr>
+      <w:tr>
+        <w:tc>
+          <w:tcPr/>
+          <w:p>
+            <w:pPr>
+              <w:pStyle w:val="Compact"/>
+              <w:jc w:val="left"/>
+            </w:pPr>
+            <w:r>
+              <w:t xml:space="preserve">Localization EN / 中文 + guide videos</w:t>
+            </w:r>
+          </w:p>
+        </w:tc>
+        <w:tc>
+          <w:tcPr/>
+          <w:p>
+            <w:pPr>
+              <w:pStyle w:val="Compact"/>
+              <w:jc w:val="left"/>
+            </w:pPr>
+            <w:r>
+              <w:t xml:space="preserve">one-time</w:t>
+            </w:r>
+          </w:p>
+        </w:tc>
+        <w:tc>
+          <w:tcPr/>
+          <w:p>
+            <w:pPr>
+              <w:pStyle w:val="Compact"/>
+              <w:jc w:val="left"/>
+            </w:pPr>
+            <w:r>
+              <w:t xml:space="preserve">800,000</w:t>
+            </w:r>
+          </w:p>
+        </w:tc>
+      </w:tr>
+      <w:tr>
+        <w:tc>
+          <w:tcPr/>
+          <w:p>
+            <w:pPr>
+              <w:pStyle w:val="Compact"/>
+              <w:jc w:val="left"/>
+            </w:pPr>
+            <w:r>
+              <w:t xml:space="preserve">Payment integration &amp; testing</w:t>
+            </w:r>
+          </w:p>
+        </w:tc>
+        <w:tc>
+          <w:tcPr/>
+          <w:p>
+            <w:pPr>
+              <w:pStyle w:val="Compact"/>
+              <w:jc w:val="left"/>
+            </w:pPr>
+            <w:r>
+              <w:t xml:space="preserve">one-time</w:t>
+            </w:r>
+          </w:p>
+        </w:tc>
+        <w:tc>
+          <w:tcPr/>
+          <w:p>
+            <w:pPr>
+              <w:pStyle w:val="Compact"/>
+              <w:jc w:val="left"/>
+            </w:pPr>
+            <w:r>
+              <w:t xml:space="preserve">700,000</w:t>
+            </w:r>
+          </w:p>
+        </w:tc>
+      </w:tr>
+      <w:tr>
+        <w:tc>
+          <w:tcPr/>
+          <w:p>
+            <w:pPr>
+              <w:pStyle w:val="Compact"/>
+              <w:jc w:val="left"/>
+            </w:pPr>
+            <w:r>
+              <w:t xml:space="preserve">AI concierge setup &amp; testing</w:t>
+            </w:r>
+          </w:p>
+        </w:tc>
+        <w:tc>
+          <w:tcPr/>
+          <w:p>
+            <w:pPr>
+              <w:pStyle w:val="Compact"/>
+              <w:jc w:val="left"/>
+            </w:pPr>
+            <w:r>
+              <w:t xml:space="preserve">one-time</w:t>
+            </w:r>
+          </w:p>
+        </w:tc>
+        <w:tc>
+          <w:tcPr/>
+          <w:p>
+            <w:pPr>
+              <w:pStyle w:val="Compact"/>
+              <w:jc w:val="left"/>
+            </w:pPr>
+            <w:r>
+              <w:t xml:space="preserve">300,000</w:t>
+            </w:r>
+          </w:p>
+        </w:tc>
+      </w:tr>
+      <w:tr>
+        <w:tc>
+          <w:tcPr/>
+          <w:p>
+            <w:pPr>
+              <w:pStyle w:val="Compact"/>
+              <w:jc w:val="left"/>
+            </w:pPr>
+            <w:r>
+              <w:t xml:space="preserve">Marketing &amp; acquisition (Xiaohongshu content, pilot)</w:t>
+            </w:r>
+          </w:p>
+        </w:tc>
+        <w:tc>
+          <w:tcPr/>
+          <w:p>
+            <w:pPr>
+              <w:pStyle w:val="Compact"/>
+              <w:jc w:val="left"/>
+            </w:pPr>
+            <w:r>
+              <w:t xml:space="preserve">recurring</w:t>
+            </w:r>
+          </w:p>
+        </w:tc>
+        <w:tc>
+          <w:tcPr/>
+          <w:p>
+            <w:pPr>
+              <w:pStyle w:val="Compact"/>
+              <w:jc w:val="left"/>
+            </w:pPr>
+            <w:r>
+              <w:t xml:space="preserve">1,700,000</w:t>
+            </w:r>
+          </w:p>
+        </w:tc>
+      </w:tr>
+      <w:tr>
+        <w:tc>
+          <w:tcPr/>
+          <w:p>
+            <w:pPr>
+              <w:pStyle w:val="Compact"/>
+              <w:jc w:val="left"/>
+            </w:pPr>
+            <w:r>
+              <w:t xml:space="preserve">Hosting + AI usage</w:t>
+            </w:r>
+          </w:p>
+        </w:tc>
+        <w:tc>
+          <w:tcPr/>
+          <w:p>
+            <w:pPr>
+              <w:pStyle w:val="Compact"/>
+              <w:jc w:val="left"/>
+            </w:pPr>
+            <w:r>
+              <w:t xml:space="preserve">recurring</w:t>
+            </w:r>
+          </w:p>
+        </w:tc>
+        <w:tc>
+          <w:tcPr/>
+          <w:p>
+            <w:pPr>
+              <w:pStyle w:val="Compact"/>
+              <w:jc w:val="left"/>
+            </w:pPr>
+            <w:r>
+              <w:t xml:space="preserve">500,000</w:t>
+            </w:r>
+          </w:p>
+        </w:tc>
+      </w:tr>
+      <w:tr>
+        <w:tc>
+          <w:tcPr/>
+          <w:p>
+            <w:pPr>
+              <w:pStyle w:val="Compact"/>
+              <w:jc w:val="left"/>
+            </w:pPr>
+            <w:r>
+              <w:t xml:space="preserve">Support &amp; pilot</w:t>
+            </w:r>
+          </w:p>
+        </w:tc>
+        <w:tc>
+          <w:tcPr/>
+          <w:p>
+            <w:pPr>
+              <w:pStyle w:val="Compact"/>
+              <w:jc w:val="left"/>
+            </w:pPr>
+            <w:r>
+              <w:t xml:space="preserve">recurring</w:t>
+            </w:r>
+          </w:p>
+        </w:tc>
+        <w:tc>
+          <w:tcPr/>
+          <w:p>
+            <w:pPr>
+              <w:pStyle w:val="Compact"/>
+              <w:jc w:val="left"/>
+            </w:pPr>
+            <w:r>
+              <w:t xml:space="preserve">300,000</w:t>
             </w:r>
           </w:p>
         </w:tc>
@@ -1144,19 +1296,19 @@
               <w:jc w:val="left"/>
             </w:pPr>
             <w:r>
-              <w:t xml:space="preserve">Contingency</w:t>
-            </w:r>
-          </w:p>
-        </w:tc>
-        <w:tc>
-          <w:tcPr/>
-          <w:p>
-            <w:pPr>
-              <w:pStyle w:val="Compact"/>
-              <w:jc w:val="left"/>
-            </w:pPr>
-            <w:r>
-              <w:t xml:space="preserve">1,000,000</w:t>
+              <w:t xml:space="preserve">reserve</w:t>
+            </w:r>
+          </w:p>
+        </w:tc>
+        <w:tc>
+          <w:tcPr/>
+          <w:p>
+            <w:pPr>
+              <w:pStyle w:val="Compact"/>
+              <w:jc w:val="left"/>
+            </w:pPr>
+            <w:r>
+              <w:t xml:space="preserve">400,000</w:t>
             </w:r>
           </w:p>
         </w:tc>
@@ -1182,7 +1334,7 @@
               <w:t xml:space="preserve"> </w:t>
             </w:r>
             <w:r>
-              <w:t xml:space="preserve">(case limit 20,000,000)</w:t>
+              <w:t xml:space="preserve">(Stage 2 limit 8,000,000)</w:t>
             </w:r>
           </w:p>
         </w:tc>
@@ -1198,7 +1350,7 @@
                 <w:bCs/>
                 <w:b/>
               </w:rPr>
-              <w:t xml:space="preserve">20,000,000</w:t>
+              <w:t xml:space="preserve">8,000,000</w:t>
             </w:r>
           </w:p>
         </w:tc>
@@ -1209,7 +1361,7 @@
         <w:pStyle w:val="BodyText"/>
       </w:pPr>
       <w:r>
-        <w:t xml:space="preserve">From year 2 running costs are 300,000 KZT per month (our estimate).</w:t>
+        <w:t xml:space="preserve">From year 2 running costs are 250,000 KZT per month (our estimate).</w:t>
       </w:r>
       <w:r>
         <w:t xml:space="preserve"> </w:t>
@@ -1345,31 +1497,31 @@
               <w:jc w:val="left"/>
             </w:pPr>
             <w:r>
-              <w:t xml:space="preserve">Lowest point (month 12)</w:t>
-            </w:r>
-          </w:p>
-        </w:tc>
-        <w:tc>
-          <w:tcPr/>
-          <w:p>
-            <w:pPr>
-              <w:pStyle w:val="Compact"/>
-              <w:jc w:val="left"/>
-            </w:pPr>
-            <w:r>
-              <w:t xml:space="preserve">-17.0M</w:t>
-            </w:r>
-          </w:p>
-        </w:tc>
-        <w:tc>
-          <w:tcPr/>
-          <w:p>
-            <w:pPr>
-              <w:pStyle w:val="Compact"/>
-              <w:jc w:val="left"/>
-            </w:pPr>
-            <w:r>
-              <w:t xml:space="preserve">-17.9M</w:t>
+              <w:t xml:space="preserve">Lowest point</w:t>
+            </w:r>
+          </w:p>
+        </w:tc>
+        <w:tc>
+          <w:tcPr/>
+          <w:p>
+            <w:pPr>
+              <w:pStyle w:val="Compact"/>
+              <w:jc w:val="left"/>
+            </w:pPr>
+            <w:r>
+              <w:t xml:space="preserve">-6.2M</w:t>
+            </w:r>
+          </w:p>
+        </w:tc>
+        <w:tc>
+          <w:tcPr/>
+          <w:p>
+            <w:pPr>
+              <w:pStyle w:val="Compact"/>
+              <w:jc w:val="left"/>
+            </w:pPr>
+            <w:r>
+              <w:t xml:space="preserve">-6.3M</w:t>
             </w:r>
           </w:p>
         </w:tc>
@@ -1403,7 +1555,7 @@
                 <w:bCs/>
                 <w:b/>
               </w:rPr>
-              <w:t xml:space="preserve">32</w:t>
+              <w:t xml:space="preserve">20</w:t>
             </w:r>
           </w:p>
         </w:tc>
@@ -1419,7 +1571,7 @@
                 <w:bCs/>
                 <w:b/>
               </w:rPr>
-              <w:t xml:space="preserve">44</w:t>
+              <w:t xml:space="preserve">25</w:t>
             </w:r>
           </w:p>
         </w:tc>
@@ -1445,19 +1597,19 @@
               <w:jc w:val="left"/>
             </w:pPr>
             <w:r>
-              <w:t xml:space="preserve">17.8M</w:t>
-            </w:r>
-          </w:p>
-        </w:tc>
-        <w:tc>
-          <w:tcPr/>
-          <w:p>
-            <w:pPr>
-              <w:pStyle w:val="Compact"/>
-              <w:jc w:val="left"/>
-            </w:pPr>
-            <w:r>
-              <w:t xml:space="preserve">3.2M</w:t>
+              <w:t xml:space="preserve">31.6M</w:t>
+            </w:r>
+          </w:p>
+        </w:tc>
+        <w:tc>
+          <w:tcPr/>
+          <w:p>
+            <w:pPr>
+              <w:pStyle w:val="Compact"/>
+              <w:jc w:val="left"/>
+            </w:pPr>
+            <w:r>
+              <w:t xml:space="preserve">17.0M</w:t>
             </w:r>
           </w:p>
         </w:tc>
@@ -1483,19 +1635,19 @@
               <w:jc w:val="left"/>
             </w:pPr>
             <w:r>
-              <w:t xml:space="preserve">month 46 / 27</w:t>
-            </w:r>
-          </w:p>
-        </w:tc>
-        <w:tc>
-          <w:tcPr/>
-          <w:p>
-            <w:pPr>
-              <w:pStyle w:val="Compact"/>
-              <w:jc w:val="left"/>
-            </w:pPr>
-            <w:r>
-              <w:t xml:space="preserve">after 48 / month 34</w:t>
+              <w:t xml:space="preserve">month 26 / 17</w:t>
+            </w:r>
+          </w:p>
+        </w:tc>
+        <w:tc>
+          <w:tcPr/>
+          <w:p>
+            <w:pPr>
+              <w:pStyle w:val="Compact"/>
+              <w:jc w:val="left"/>
+            </w:pPr>
+            <w:r>
+              <w:t xml:space="preserve">month 34 / month 21</w:t>
             </w:r>
           </w:p>
         </w:tc>
@@ -1506,7 +1658,7 @@
         <w:pStyle w:val="BodyText"/>
       </w:pPr>
       <w:r>
-        <w:t xml:space="preserve">If results are 30% worse, the project still pays back, but in month 44 instead of 32, and only if the margin is about 30% or more. In that case we would move marketing to free channels (postcards, our own Xiaohongshu posts), delay paid ads and keep running costs at the minimum.</w:t>
+        <w:t xml:space="preserve">If results are 30% worse, the project still pays back, but in month 25 instead of 20. In that case we would move marketing to free channels (postcards, our own Xiaohongshu posts), delay paid ads and keep running costs at the minimum.</w:t>
       </w:r>
       <w:r>
         <w:t xml:space="preserve"> </w:t>
@@ -1729,7 +1881,7 @@
         <w:pStyle w:val="FirstParagraph"/>
       </w:pPr>
       <w:r>
-        <w:t xml:space="preserve">Foreign travelers do not book Saryarqa Routes because they cannot see what is included, cannot pay with their card and cannot check the company. Saryarqa Go fixes all four problems in one product, starting with Chinese travelers who can already visit without a visa. It fits the 20 million KZT budget and pays back in month 32, or month 44 if results are 30% worse. Our next steps: interview at least 10 Chinese travelers, check the real margin with the company, and apply to payment providers in the first week.</w:t>
+        <w:t xml:space="preserve">Foreign travelers do not book Saryarqa Routes because they cannot see what is included, cannot pay with their card and cannot check the company. Saryarqa Go fixes all four problems in one product, starting with Chinese travelers who can already visit without a visa. It fits the 8,000,000 KZT limit and pays back in month 20, or month 25 if results are 30% worse. Our next steps: interview at least 10 Chinese travelers, check the real margin with the company, and apply to payment providers in the first week.</w:t>
       </w:r>
     </w:p>
     <w:p>

</xml_diff>